<commit_message>
chore: adiciona placeholders aos campos do template de contrato
</commit_message>
<xml_diff>
--- a/storage/app/templates/contrato.docx
+++ b/storage/app/templates/contrato.docx
@@ -189,15 +189,7 @@
             </w:r>
             <w:r>
               <w:rPr/>
-              <w:t>_________________</w:t>
-            </w:r>
-            <w:r>
-              <w:rPr/>
-              <w:t>_______</w:t>
-            </w:r>
-            <w:r>
-              <w:rPr/>
-              <w:t>_________</w:t>
+              <w:t>${cliente_nome}</w:t>
             </w:r>
           </w:p>
         </w:tc>
@@ -229,11 +221,7 @@
             </w:r>
             <w:r>
               <w:rPr/>
-              <w:t>________________________</w:t>
-            </w:r>
-            <w:r>
-              <w:rPr/>
-              <w:t>_____</w:t>
+              <w:t>${cliente_cpf}</w:t>
             </w:r>
           </w:p>
         </w:tc>
@@ -268,11 +256,7 @@
             </w:r>
             <w:r>
               <w:rPr/>
-              <w:t>________________________</w:t>
-            </w:r>
-            <w:r>
-              <w:rPr/>
-              <w:t>_______</w:t>
+              <w:t>${cliente_telefone}</w:t>
             </w:r>
           </w:p>
         </w:tc>
@@ -340,7 +324,7 @@
             </w:r>
             <w:r>
               <w:rPr/>
-              <w:t>________________________________________________</w:t>
+              <w:t>${cliente_endereco}</w:t>
             </w:r>
           </w:p>
         </w:tc>
@@ -550,14 +534,7 @@
                 <w:b w:val="false"/>
                 <w:bCs w:val="false"/>
               </w:rPr>
-              <w:t>Data do Evento: ______________________</w:t>
-            </w:r>
-            <w:r>
-              <w:rPr>
-                <w:b w:val="false"/>
-                <w:bCs w:val="false"/>
-              </w:rPr>
-              <w:t>____</w:t>
+              <w:t>Data do Evento: ${data_evento}</w:t>
             </w:r>
           </w:p>
         </w:tc>
@@ -588,14 +565,7 @@
                 <w:b w:val="false"/>
                 <w:bCs w:val="false"/>
               </w:rPr>
-              <w:t>Horário da Retirada:________________________</w:t>
-            </w:r>
-            <w:r>
-              <w:rPr>
-                <w:b w:val="false"/>
-                <w:bCs w:val="false"/>
-              </w:rPr>
-              <w:t>________</w:t>
+              <w:t>Horário da Retirada: ${retirada}</w:t>
             </w:r>
           </w:p>
         </w:tc>
@@ -632,7 +602,7 @@
                 <w:b w:val="false"/>
                 <w:bCs w:val="false"/>
               </w:rPr>
-              <w:t xml:space="preserve"> _____________________</w:t>
+              <w:t xml:space="preserve"> ${devolucao}</w:t>
             </w:r>
           </w:p>
         </w:tc>
@@ -692,7 +662,7 @@
           <w:sz w:val="24"/>
           <w:szCs w:val="24"/>
         </w:rPr>
-        <w:t xml:space="preserve"> R$ __________ (__________________).</w:t>
+        <w:t xml:space="preserve"> ${valor_total} (__________________).</w:t>
       </w:r>
     </w:p>
     <w:p>

</xml_diff>